<commit_message>
feat: complete four-in-one IT lesson polish with Grade 3 & Grade 4 benchmarks, offline checks, and Word beautification
</commit_message>
<xml_diff>
--- a/resources/pandoc/模板.docx
+++ b/resources/pandoc/模板.docx
@@ -316,8 +316,8 @@
       <w:footnotePr>
         <w:numRestart w:val="eachSect"/>
       </w:footnotePr>
-      <w:pgSz w:w="12240" w:h="15840"/>
-      <w:pgMar w:top="1440" w:right="1800" w:bottom="1440" w:left="1800" w:header="720" w:footer="720" w:gutter="0"/>
+      <w:pgSz w:w="11906" w:h="16838"/>
+      <w:pgMar w:top="1020" w:right="1134" w:bottom="1020" w:left="1134" w:header="720" w:footer="720" w:gutter="0"/>
       <w:cols w:space="720"/>
     </w:sectPr>
   </w:body>
@@ -768,6 +768,12 @@
   <w:style w:type="paragraph" w:default="1" w:styleId="a">
     <w:name w:val="Normal"/>
     <w:qFormat/>
+    <w:pPr>
+      <w:spacing w:line="276" w:lineRule="auto" w:after="40" w:before="0"/>
+    </w:pPr>
+    <w:rPr>
+      <w:sz w:val="21"/>
+    </w:rPr>
   </w:style>
   <w:style w:type="paragraph" w:styleId="1">
     <w:name w:val="heading 1"/>
@@ -780,37 +786,37 @@
     <w:pPr>
       <w:keepNext/>
       <w:keepLines/>
-      <w:spacing w:before="360" w:after="80"/>
+      <w:spacing w:before="120" w:after="80"/>
       <w:jc w:val="center"/>
       <w:outlineLvl w:val="0"/>
-    </w:pPr>
-    <w:rPr>
-      <w:rFonts w:asciiTheme="majorHAnsi" w:eastAsia="微软雅黑" w:hAnsiTheme="majorHAnsi" w:cstheme="majorBidi"/>
-      <w:color w:val="0F4761" w:themeColor="accent1" w:themeShade="BF"/>
-      <w:sz w:val="44"/>
-      <w:szCs w:val="40"/>
-    </w:rPr>
-  </w:style>
-  <w:style w:type="paragraph" w:styleId="2">
-    <w:name w:val="heading 2"/>
-    <w:basedOn w:val="a"/>
-    <w:next w:val="a0"/>
-    <w:link w:val="20"/>
-    <w:uiPriority w:val="9"/>
-    <w:semiHidden/>
-    <w:unhideWhenUsed/>
-    <w:qFormat/>
-    <w:rsid w:val="00C203DB"/>
-    <w:pPr>
-      <w:keepNext/>
-      <w:keepLines/>
-      <w:spacing w:before="160" w:after="80"/>
-      <w:outlineLvl w:val="1"/>
     </w:pPr>
     <w:rPr>
       <w:rFonts w:asciiTheme="majorHAnsi" w:eastAsia="微软雅黑" w:hAnsiTheme="majorHAnsi" w:cstheme="majorBidi"/>
       <w:color w:val="0F4761" w:themeColor="accent1" w:themeShade="BF"/>
       <w:sz w:val="32"/>
+      <w:szCs w:val="40"/>
+    </w:rPr>
+  </w:style>
+  <w:style w:type="paragraph" w:styleId="2">
+    <w:name w:val="heading 2"/>
+    <w:basedOn w:val="a"/>
+    <w:next w:val="a0"/>
+    <w:link w:val="20"/>
+    <w:uiPriority w:val="9"/>
+    <w:semiHidden/>
+    <w:unhideWhenUsed/>
+    <w:qFormat/>
+    <w:rsid w:val="00C203DB"/>
+    <w:pPr>
+      <w:keepNext/>
+      <w:keepLines/>
+      <w:spacing w:before="100" w:after="40"/>
+      <w:outlineLvl w:val="1"/>
+    </w:pPr>
+    <w:rPr>
+      <w:rFonts w:asciiTheme="majorHAnsi" w:eastAsia="微软雅黑" w:hAnsiTheme="majorHAnsi" w:cstheme="majorBidi"/>
+      <w:color w:val="0F4761" w:themeColor="accent1" w:themeShade="BF"/>
+      <w:sz w:val="26"/>
       <w:szCs w:val="32"/>
     </w:rPr>
   </w:style>
@@ -827,14 +833,14 @@
     <w:pPr>
       <w:keepNext/>
       <w:keepLines/>
-      <w:spacing w:before="160" w:after="80"/>
+      <w:spacing w:before="80" w:after="40"/>
       <w:jc w:val="center"/>
       <w:outlineLvl w:val="2"/>
     </w:pPr>
     <w:rPr>
       <w:rFonts w:eastAsia="微软雅黑" w:cstheme="majorBidi"/>
       <w:color w:val="0F4761" w:themeColor="accent1" w:themeShade="BF"/>
-      <w:sz w:val="28"/>
+      <w:sz w:val="22"/>
       <w:szCs w:val="28"/>
     </w:rPr>
   </w:style>
@@ -1003,10 +1009,11 @@
     <w:qFormat/>
     <w:rsid w:val="005B72F6"/>
     <w:pPr>
-      <w:spacing w:before="180" w:after="180" w:line="360" w:lineRule="auto"/>
+      <w:spacing w:before="0" w:after="40" w:line="276" w:lineRule="auto"/>
     </w:pPr>
     <w:rPr>
       <w:rFonts w:eastAsia="宋体"/>
+      <w:sz w:val="21"/>
     </w:rPr>
   </w:style>
   <w:style w:type="paragraph" w:customStyle="1" w:styleId="FirstParagraph">
@@ -1014,6 +1021,12 @@
     <w:basedOn w:val="a0"/>
     <w:next w:val="a0"/>
     <w:qFormat/>
+    <w:pPr>
+      <w:spacing w:line="276" w:lineRule="auto" w:after="40" w:before="0"/>
+    </w:pPr>
+    <w:rPr>
+      <w:sz w:val="21"/>
+    </w:rPr>
   </w:style>
   <w:style w:type="paragraph" w:customStyle="1" w:styleId="Compact">
     <w:name w:val="Compact"/>
@@ -1021,8 +1034,11 @@
     <w:qFormat/>
     <w:rsid w:val="00F920DC"/>
     <w:pPr>
-      <w:spacing w:before="0" w:after="0" w:line="400" w:lineRule="exact"/>
-    </w:pPr>
+      <w:spacing w:before="0" w:after="40" w:line="276" w:lineRule="auto"/>
+    </w:pPr>
+    <w:rPr>
+      <w:sz w:val="21"/>
+    </w:rPr>
   </w:style>
   <w:style w:type="paragraph" w:styleId="a4">
     <w:name w:val="Title"/>
@@ -1367,10 +1383,12 @@
     <w:rsid w:val="005B72F6"/>
     <w:pPr>
       <w:keepNext/>
+      <w:spacing w:line="264" w:lineRule="auto" w:after="20" w:before="20"/>
       <w:jc w:val="center"/>
     </w:pPr>
     <w:rPr>
       <w:rFonts w:eastAsia="黑体"/>
+      <w:sz w:val="19"/>
     </w:rPr>
   </w:style>
   <w:style w:type="paragraph" w:customStyle="1" w:styleId="ImageCaption">

</xml_diff>